<commit_message>
feat: Update project report format to pdf and remove temporary files
</commit_message>
<xml_diff>
--- a/docs/CS6220_Final_Project_Report.docx
+++ b/docs/CS6220_Final_Project_Report.docx
@@ -102,7 +102,15 @@
         <w:spacing w:after="80"/>
       </w:pPr>
       <w:r>
-        <w:t>This paper presents Retail Inventory Twin, a lightweight digital model that combines 27 months of sales history, current stock levels, and weather conditions to estimate when individual products are likely to run out. The system employs Meta's Prophet algorithm [5] for time-series forecasting with weather variables as external regressors, a Retrieval-Augmented Generation (RAG) layer for input validation using sentence embeddings and vector similarity search, and an interactive web interface built with FastAPI. The system is designed to be self-contained, requiring no external API keys or cloud infrastructure, making it accessible to small retail operators with limited technical resources. By integrating weather awareness into the forecasting pipeline, the system demonstrates measurable improvements in demand prediction accuracy, particularly for temperature-sensitive products such as hot espresso-based beverages.</w:t>
+        <w:t xml:space="preserve">This paper presents Retail Inventory Twin, a lightweight digital model that combines 27 months of sales history, current stock levels, and weather conditions to estimate when individual products are likely to run out. The system employs Meta's Prophet algorithm [5] for time-series forecasting with weather variables as external regressors, a Retrieval-Augmented Generation (RAG) layer for input validation using sentence embeddings and vector similarity search, and an interactive web interface built with </w:t>
+      </w:r>
+      <w:proofErr w:type="spellStart"/>
+      <w:r>
+        <w:t>FastAPI</w:t>
+      </w:r>
+      <w:proofErr w:type="spellEnd"/>
+      <w:r>
+        <w:t>. The system is designed to be self-contained, requiring no external API keys or cloud infrastructure, making it accessible to small retail operators with limited technical resources. By integrating weather awareness into the forecasting pipeline, the system demonstrates measurable improvements in demand prediction accuracy, particularly for temperature-sensitive products such as hot espresso-based beverages.</w:t>
       </w:r>
     </w:p>
     <w:p>
@@ -154,7 +162,31 @@
         <w:spacing w:after="80"/>
       </w:pPr>
       <w:r>
-        <w:t>For each of the eight product items, two Prophet model variants are fitted. The baseline model uses only weekly and yearly seasonality with multiplicative seasonality mode, which better captures demand that scales proportionally with seasonal cycles rather than shifting by a fixed additive amount. The weather-augmented model extends the baseline by adding two external regressors: daily average temperature (temp_avg) and daily precipitation. Key hyperparameters include changepoint_prior_scale = 0.05 (conservative trend flexibility to avoid overfitting), seasonality_prior_scale = 10.0 (allowing strong seasonal patterns to emerge), and multiplicative seasonality mode. The models are serialized as Python pickle files for fast inference without retraining.</w:t>
+        <w:t>For each of the eight product items, two Prophet model variants are fitted. The baseline model uses only weekly and yearly seasonality with multiplicative seasonality mode, which better captures demand that scales proportionally with seasonal cycles rather than shifting by a fixed additive amount. The weather-augmented model extends the baseline by adding two external regressors: daily average temperature (</w:t>
+      </w:r>
+      <w:proofErr w:type="spellStart"/>
+      <w:r>
+        <w:t>temp_avg</w:t>
+      </w:r>
+      <w:proofErr w:type="spellEnd"/>
+      <w:r>
+        <w:t xml:space="preserve">) and daily precipitation. Key hyperparameters include </w:t>
+      </w:r>
+      <w:proofErr w:type="spellStart"/>
+      <w:r>
+        <w:t>changepoint_prior_scale</w:t>
+      </w:r>
+      <w:proofErr w:type="spellEnd"/>
+      <w:r>
+        <w:t xml:space="preserve"> = 0.05 (conservative trend flexibility to avoid overfitting), </w:t>
+      </w:r>
+      <w:proofErr w:type="spellStart"/>
+      <w:r>
+        <w:t>seasonality_prior_scale</w:t>
+      </w:r>
+      <w:proofErr w:type="spellEnd"/>
+      <w:r>
+        <w:t xml:space="preserve"> = 10.0 (allowing strong seasonal patterns to emerge), and multiplicative seasonality mode. The models are serialized as Python pickle files for fast inference without retraining.</w:t>
       </w:r>
     </w:p>
     <w:p>
@@ -178,7 +210,15 @@
         <w:spacing w:after="80"/>
       </w:pPr>
       <w:r>
-        <w:t>The system maintains an in-process ChromaDB [6] vector store containing 19 short text documents in three categories: (a) eight item profile documents describing each trained product's name, category, typical demand range, and seasonal pattern; (b) four schema definition documents specifying expected CSV column formats and valid item identifiers; and (c) seven boundary documents describing out-of-scope domains such as electronics retail, auto parts, medical supplies, and financial ledgers.</w:t>
+        <w:t xml:space="preserve">The system maintains an in-process </w:t>
+      </w:r>
+      <w:proofErr w:type="spellStart"/>
+      <w:r>
+        <w:t>ChromaDB</w:t>
+      </w:r>
+      <w:proofErr w:type="spellEnd"/>
+      <w:r>
+        <w:t xml:space="preserve"> [6] vector store containing 19 short text documents in three categories: (a) eight item profile documents describing each trained product's name, category, typical demand range, and seasonal pattern; (b) four schema definition documents specifying expected CSV column formats and valid item identifiers; and (c) seven boundary documents describing out-of-scope domains such as electronics retail, auto parts, medical supplies, and financial ledgers.</w:t>
       </w:r>
     </w:p>
     <w:p>
@@ -202,7 +242,15 @@
         <w:spacing w:after="80"/>
       </w:pPr>
       <w:r>
-        <w:t>The system is deployed as a FastAPI [8] web application with four endpoints: GET / serves the HTML frontend, POST /validate performs two-stage schema and RAG validation, POST /forecast saves uploaded files and runs the full pipeline, and GET /report returns the most recent forecast report. The frontend is a single-page HTML/CSS/JavaScript application with no framework dependencies, using the Fetch API for asynchronous communication. The user interface provides file upload controls for sales CSVs and stock snapshot, a retrain toggle, real-time status banners with color-coded feedback (info, success, warning, error), and a dark-themed report display area. The backend handles Windows UTF-8 encoding compatibility by setting PYTHONIOENCODING=utf-8 in subprocess environments.</w:t>
+        <w:t xml:space="preserve">The system is deployed as a </w:t>
+      </w:r>
+      <w:proofErr w:type="spellStart"/>
+      <w:r>
+        <w:t>FastAPI</w:t>
+      </w:r>
+      <w:proofErr w:type="spellEnd"/>
+      <w:r>
+        <w:t xml:space="preserve"> [8] web application with four endpoints: GET / serves the HTML frontend, POST /validate performs two-stage schema and RAG validation, POST /forecast saves uploaded files and runs the full pipeline, and GET /report returns the most recent forecast report. The frontend is a single-page HTML/CSS/JavaScript application with no framework dependencies, using the Fetch API for asynchronous communication. The user interface provides file upload controls for sales CSVs and stock snapshot, a retrain toggle, real-time status banners with color-coded feedback (info, success, warning, error), and a dark-themed report display area. The backend handles Windows UTF-8 encoding compatibility by setting PYTHONIOENCODING=utf-8 in subprocess environments.</w:t>
       </w:r>
     </w:p>
     <w:p>
@@ -278,12 +326,14 @@
             <w:tcW w:w="1872" w:type="dxa"/>
           </w:tcPr>
           <w:p>
+            <w:proofErr w:type="spellStart"/>
             <w:r>
               <w:rPr>
                 <w:sz w:val="20"/>
               </w:rPr>
               <w:t>transaction_id</w:t>
             </w:r>
+            <w:proofErr w:type="spellEnd"/>
           </w:p>
         </w:tc>
         <w:tc>
@@ -310,12 +360,14 @@
             <w:pPr>
               <w:cnfStyle w:val="100000000000" w:firstRow="1" w:lastRow="0" w:firstColumn="0" w:lastColumn="0" w:oddVBand="0" w:evenVBand="0" w:oddHBand="0" w:evenHBand="0" w:firstRowFirstColumn="0" w:firstRowLastColumn="0" w:lastRowFirstColumn="0" w:lastRowLastColumn="0"/>
             </w:pPr>
+            <w:proofErr w:type="spellStart"/>
             <w:r>
               <w:rPr>
                 <w:sz w:val="20"/>
               </w:rPr>
               <w:t>item_id</w:t>
             </w:r>
+            <w:proofErr w:type="spellEnd"/>
           </w:p>
         </w:tc>
         <w:tc>
@@ -326,12 +378,14 @@
             <w:pPr>
               <w:cnfStyle w:val="100000000000" w:firstRow="1" w:lastRow="0" w:firstColumn="0" w:lastColumn="0" w:oddVBand="0" w:evenVBand="0" w:oddHBand="0" w:evenHBand="0" w:firstRowFirstColumn="0" w:firstRowLastColumn="0" w:lastRowFirstColumn="0" w:lastRowLastColumn="0"/>
             </w:pPr>
+            <w:proofErr w:type="spellStart"/>
             <w:r>
               <w:rPr>
                 <w:sz w:val="20"/>
               </w:rPr>
               <w:t>item_name</w:t>
             </w:r>
+            <w:proofErr w:type="spellEnd"/>
           </w:p>
         </w:tc>
         <w:tc>
@@ -700,7 +754,31 @@
         <w:spacing w:after="80"/>
       </w:pPr>
       <w:r>
-        <w:t>Weather data is generated using a sinusoidal model calibrated to Boston's annual temperature cycle: temp_avg = 10.0 - 13.0 * cos(2 * pi * day_of_year / 365), producing approximately -3 degrees Celsius in January and 23 degrees Celsius in July, with Gaussian noise (sigma = 2.5 degrees Celsius) added for day-to-day variability. Precipitation occurs on approximately 30% of days. The weather dataset spans the same 27-month training window plus a 14-day forecast horizon (March 28 to April 10, 2026). Each record includes date, average temperature, minimum temperature, maximum temperature, precipitation amount, condition description, and data source label.</w:t>
+        <w:t xml:space="preserve">Weather data is generated using a sinusoidal model calibrated to Boston's annual temperature cycle: </w:t>
+      </w:r>
+      <w:proofErr w:type="spellStart"/>
+      <w:r>
+        <w:t>temp_avg</w:t>
+      </w:r>
+      <w:proofErr w:type="spellEnd"/>
+      <w:r>
+        <w:t xml:space="preserve"> = 10.0 - 13.0 * </w:t>
+      </w:r>
+      <w:proofErr w:type="gramStart"/>
+      <w:r>
+        <w:t>cos(</w:t>
+      </w:r>
+      <w:proofErr w:type="gramEnd"/>
+      <w:r>
+        <w:t xml:space="preserve">2 * pi * </w:t>
+      </w:r>
+      <w:proofErr w:type="spellStart"/>
+      <w:r>
+        <w:t>day_of_year</w:t>
+      </w:r>
+      <w:proofErr w:type="spellEnd"/>
+      <w:r>
+        <w:t xml:space="preserve"> / 365), producing approximately -3 degrees Celsius in January and 23 degrees Celsius in July, with Gaussian noise (sigma = 2.5 degrees Celsius) added for day-to-day variability. Precipitation occurs on approximately 30% of days. The weather dataset spans the same 27-month training window plus a 14-day forecast horizon (March 28 to April 10, 2026). Each record includes date, average temperature, minimum temperature, maximum temperature, precipitation amount, condition description, and data source label.</w:t>
       </w:r>
     </w:p>
     <w:p>
@@ -732,7 +810,23 @@
         <w:spacing w:after="80"/>
       </w:pPr>
       <w:r>
-        <w:t>The raw transaction-level data undergoes several preprocessing steps. Step 1 aggregates individual transactions into daily demand per item by summing quantities across all transactions for each (date, item_id) pair. Step 2 loads the aggregated data and stock snapshot into a SQLite database, enabling SQL-based data quality checks and joins. Step 4 performs a left-join of daily demand with weather data on the date column, producing the modeling table used for Prophet training. Missing weather records (if any) result in NaN values that Prophet handles natively. A data quality consideration is the use of synthetic data: while it ensures complete coverage and known ground truth, it lacks the noise patterns and anomalies (holidays, promotions, supply disruptions) that characterize real-world retail data.</w:t>
+        <w:t xml:space="preserve">The raw transaction-level data undergoes several preprocessing steps. Step 1 aggregates individual transactions into daily demand per item by summing quantities across all transactions for each (date, </w:t>
+      </w:r>
+      <w:proofErr w:type="spellStart"/>
+      <w:r>
+        <w:t>item_id</w:t>
+      </w:r>
+      <w:proofErr w:type="spellEnd"/>
+      <w:r>
+        <w:t xml:space="preserve">) pair. Step 2 loads the aggregated data and stock snapshot into a SQLite database, enabling SQL-based data quality checks and joins. Step 4 performs a left-join of daily demand with weather data on the date column, producing the modeling table used for Prophet training. Missing weather records (if any) result in </w:t>
+      </w:r>
+      <w:proofErr w:type="spellStart"/>
+      <w:r>
+        <w:t>NaN</w:t>
+      </w:r>
+      <w:proofErr w:type="spellEnd"/>
+      <w:r>
+        <w:t xml:space="preserve"> values that Prophet handles natively. A data quality consideration is the use of synthetic data: while it ensures complete coverage and known ground truth, it lacks the noise patterns and anomalies (holidays, promotions, supply disruptions) that characterize real-world retail data.</w:t>
       </w:r>
     </w:p>
     <w:p>
@@ -1707,71 +1801,13 @@
     <w:p>
       <w:pPr>
         <w:pStyle w:val="21"/>
-      </w:pPr>
-      <w:r>
-        <w:t>4.3 Application Demonstration</w:t>
-      </w:r>
-    </w:p>
-    <w:p>
-      <w:pPr>
-        <w:spacing w:after="80"/>
         <w:rPr>
           <w:rFonts w:eastAsia="宋体" w:hint="eastAsia"/>
           <w:lang w:eastAsia="zh-CN"/>
         </w:rPr>
       </w:pPr>
       <w:r>
-        <w:rPr>
-          <w:rFonts w:eastAsia="宋体"/>
-          <w:lang w:eastAsia="zh-CN"/>
-        </w:rPr>
-        <w:drawing>
-          <wp:inline distT="0" distB="0" distL="0" distR="0" wp14:anchorId="68933B67" wp14:editId="69E0AE8B">
-            <wp:extent cx="4857750" cy="3128474"/>
-            <wp:effectExtent l="0" t="0" r="0" b="0"/>
-            <wp:docPr id="388094479" name="图片 1"/>
-            <wp:cNvGraphicFramePr>
-              <a:graphicFrameLocks xmlns:a="http://schemas.openxmlformats.org/drawingml/2006/main" noChangeAspect="1"/>
-            </wp:cNvGraphicFramePr>
-            <a:graphic xmlns:a="http://schemas.openxmlformats.org/drawingml/2006/main">
-              <a:graphicData uri="http://schemas.openxmlformats.org/drawingml/2006/picture">
-                <pic:pic xmlns:pic="http://schemas.openxmlformats.org/drawingml/2006/picture">
-                  <pic:nvPicPr>
-                    <pic:cNvPr id="388094479" name=""/>
-                    <pic:cNvPicPr/>
-                  </pic:nvPicPr>
-                  <pic:blipFill>
-                    <a:blip r:embed="rId6"/>
-                    <a:stretch>
-                      <a:fillRect/>
-                    </a:stretch>
-                  </pic:blipFill>
-                  <pic:spPr>
-                    <a:xfrm>
-                      <a:off x="0" y="0"/>
-                      <a:ext cx="4864153" cy="3132598"/>
-                    </a:xfrm>
-                    <a:prstGeom prst="rect">
-                      <a:avLst/>
-                    </a:prstGeom>
-                  </pic:spPr>
-                </pic:pic>
-              </a:graphicData>
-            </a:graphic>
-          </wp:inline>
-        </w:drawing>
-      </w:r>
-    </w:p>
-    <w:p>
-      <w:pPr>
-        <w:spacing w:after="80"/>
-        <w:rPr>
-          <w:rFonts w:eastAsia="宋体" w:hint="eastAsia"/>
-          <w:lang w:eastAsia="zh-CN"/>
-        </w:rPr>
-      </w:pPr>
-      <w:r>
-        <w:t>(1) the main upload interface</w:t>
+        <w:t>4.3 Application Demonstration</w:t>
       </w:r>
     </w:p>
     <w:p>
@@ -1782,25 +1818,16 @@
           <w:lang w:eastAsia="zh-CN"/>
         </w:rPr>
       </w:pPr>
-    </w:p>
-    <w:p>
-      <w:pPr>
-        <w:spacing w:after="80"/>
+      <w:r>
         <w:rPr>
           <w:rFonts w:eastAsia="宋体"/>
+          <w:noProof/>
           <w:lang w:eastAsia="zh-CN"/>
         </w:rPr>
-      </w:pPr>
-      <w:r>
-        <w:rPr>
-          <w:rFonts w:eastAsia="宋体"/>
-          <w:lang w:eastAsia="zh-CN"/>
-        </w:rPr>
-        <w:lastRenderedPageBreak/>
         <w:drawing>
-          <wp:inline distT="0" distB="0" distL="0" distR="0" wp14:anchorId="26C45F2B" wp14:editId="72382F39">
-            <wp:extent cx="4940300" cy="3483545"/>
-            <wp:effectExtent l="0" t="0" r="0" b="3175"/>
+          <wp:inline distT="0" distB="0" distL="0" distR="0" wp14:anchorId="26C45F2B" wp14:editId="752A5021">
+            <wp:extent cx="4254500" cy="3079461"/>
+            <wp:effectExtent l="0" t="0" r="0" b="6985"/>
             <wp:docPr id="529625819" name="图片 1"/>
             <wp:cNvGraphicFramePr>
               <a:graphicFrameLocks xmlns:a="http://schemas.openxmlformats.org/drawingml/2006/main" noChangeAspect="1"/>
@@ -1813,7 +1840,7 @@
                     <pic:cNvPicPr/>
                   </pic:nvPicPr>
                   <pic:blipFill>
-                    <a:blip r:embed="rId7"/>
+                    <a:blip r:embed="rId6"/>
                     <a:stretch>
                       <a:fillRect/>
                     </a:stretch>
@@ -1821,7 +1848,7 @@
                   <pic:spPr>
                     <a:xfrm>
                       <a:off x="0" y="0"/>
-                      <a:ext cx="4953039" cy="3492527"/>
+                      <a:ext cx="4274404" cy="3093868"/>
                     </a:xfrm>
                     <a:prstGeom prst="rect">
                       <a:avLst/>
@@ -1843,17 +1870,31 @@
         </w:rPr>
       </w:pPr>
       <w:r>
-        <w:t>2) validation in progress with spinner</w:t>
-      </w:r>
-    </w:p>
-    <w:p>
-      <w:pPr>
-        <w:spacing w:after="80"/>
         <w:rPr>
           <w:rFonts w:eastAsia="宋体" w:hint="eastAsia"/>
           <w:lang w:eastAsia="zh-CN"/>
         </w:rPr>
-      </w:pPr>
+        <w:t>1</w:t>
+      </w:r>
+      <w:r>
+        <w:t xml:space="preserve">) </w:t>
+      </w:r>
+      <w:r>
+        <w:t>the main upload interface</w:t>
+      </w:r>
+      <w:r>
+        <w:t xml:space="preserve"> </w:t>
+      </w:r>
+      <w:r>
+        <w:rPr>
+          <w:rFonts w:eastAsia="宋体" w:hint="eastAsia"/>
+          <w:lang w:eastAsia="zh-CN"/>
+        </w:rPr>
+        <w:t xml:space="preserve">and </w:t>
+      </w:r>
+      <w:r>
+        <w:t>validation in progress with spinner</w:t>
+      </w:r>
     </w:p>
     <w:p>
       <w:pPr>
@@ -1863,14 +1904,25 @@
           <w:lang w:eastAsia="zh-CN"/>
         </w:rPr>
       </w:pPr>
-      <w:r>
+    </w:p>
+    <w:p>
+      <w:pPr>
+        <w:spacing w:after="80"/>
         <w:rPr>
           <w:rFonts w:eastAsia="宋体"/>
           <w:lang w:eastAsia="zh-CN"/>
         </w:rPr>
+      </w:pPr>
+      <w:r>
+        <w:rPr>
+          <w:rFonts w:eastAsia="宋体"/>
+          <w:noProof/>
+          <w:lang w:eastAsia="zh-CN"/>
+        </w:rPr>
+        <w:lastRenderedPageBreak/>
         <w:drawing>
-          <wp:inline distT="0" distB="0" distL="0" distR="0" wp14:anchorId="7EEA9763" wp14:editId="651E189C">
-            <wp:extent cx="4976222" cy="3175000"/>
+          <wp:inline distT="0" distB="0" distL="0" distR="0" wp14:anchorId="7EEA9763" wp14:editId="3B7A5A43">
+            <wp:extent cx="4152900" cy="2451100"/>
             <wp:effectExtent l="0" t="0" r="0" b="6350"/>
             <wp:docPr id="1441950591" name="图片 1"/>
             <wp:cNvGraphicFramePr>
@@ -1884,7 +1936,7 @@
                     <pic:cNvPicPr/>
                   </pic:nvPicPr>
                   <pic:blipFill>
-                    <a:blip r:embed="rId8"/>
+                    <a:blip r:embed="rId7"/>
                     <a:stretch>
                       <a:fillRect/>
                     </a:stretch>
@@ -1892,7 +1944,7 @@
                   <pic:spPr>
                     <a:xfrm>
                       <a:off x="0" y="0"/>
-                      <a:ext cx="4979508" cy="3177097"/>
+                      <a:ext cx="4155945" cy="2452897"/>
                     </a:xfrm>
                     <a:prstGeom prst="rect">
                       <a:avLst/>
@@ -1914,7 +1966,17 @@
         </w:rPr>
       </w:pPr>
       <w:r>
-        <w:t>(3) successful validation result</w:t>
+        <w:t>(</w:t>
+      </w:r>
+      <w:r>
+        <w:rPr>
+          <w:rFonts w:eastAsia="宋体" w:hint="eastAsia"/>
+          <w:lang w:eastAsia="zh-CN"/>
+        </w:rPr>
+        <w:t>2</w:t>
+      </w:r>
+      <w:r>
+        <w:t>) successful validation result</w:t>
       </w:r>
     </w:p>
     <w:p>
@@ -1928,12 +1990,12 @@
       <w:r>
         <w:rPr>
           <w:rFonts w:eastAsia="宋体"/>
+          <w:noProof/>
           <w:lang w:eastAsia="zh-CN"/>
         </w:rPr>
-        <w:lastRenderedPageBreak/>
         <w:drawing>
-          <wp:inline distT="0" distB="0" distL="0" distR="0" wp14:anchorId="184DC4B5" wp14:editId="5126E95C">
-            <wp:extent cx="4978004" cy="3898900"/>
+          <wp:inline distT="0" distB="0" distL="0" distR="0" wp14:anchorId="184DC4B5" wp14:editId="2B2CB73A">
+            <wp:extent cx="4171950" cy="2774950"/>
             <wp:effectExtent l="0" t="0" r="0" b="6350"/>
             <wp:docPr id="560661427" name="图片 1"/>
             <wp:cNvGraphicFramePr>
@@ -1947,7 +2009,7 @@
                     <pic:cNvPicPr/>
                   </pic:nvPicPr>
                   <pic:blipFill>
-                    <a:blip r:embed="rId9"/>
+                    <a:blip r:embed="rId8"/>
                     <a:stretch>
                       <a:fillRect/>
                     </a:stretch>
@@ -1955,7 +2017,7 @@
                   <pic:spPr>
                     <a:xfrm>
                       <a:off x="0" y="0"/>
-                      <a:ext cx="4992669" cy="3910386"/>
+                      <a:ext cx="4184444" cy="2783260"/>
                     </a:xfrm>
                     <a:prstGeom prst="rect">
                       <a:avLst/>
@@ -1972,7 +2034,7 @@
       <w:pPr>
         <w:spacing w:after="80"/>
         <w:rPr>
-          <w:rFonts w:eastAsia="宋体" w:hint="eastAsia"/>
+          <w:rFonts w:eastAsia="宋体"/>
           <w:lang w:eastAsia="zh-CN"/>
         </w:rPr>
       </w:pPr>
@@ -1984,7 +2046,14 @@
         <w:t>(</w:t>
       </w:r>
       <w:r>
-        <w:t>4) RAG rejection of out-of-domain data such as electronics items</w:t>
+        <w:rPr>
+          <w:rFonts w:eastAsia="宋体" w:hint="eastAsia"/>
+          <w:lang w:eastAsia="zh-CN"/>
+        </w:rPr>
+        <w:t>3</w:t>
+      </w:r>
+      <w:r>
+        <w:t>) RAG rejection of out-of-domain data such as electronics items</w:t>
       </w:r>
     </w:p>
     <w:p>
@@ -2011,9 +2080,10 @@
         <w:rPr>
           <w:noProof/>
         </w:rPr>
+        <w:lastRenderedPageBreak/>
         <w:drawing>
-          <wp:inline distT="0" distB="0" distL="0" distR="0" wp14:anchorId="69AD40C7" wp14:editId="369AF892">
-            <wp:extent cx="4572000" cy="2032000"/>
+          <wp:inline distT="0" distB="0" distL="0" distR="0" wp14:anchorId="69AD40C7" wp14:editId="4A03FF21">
+            <wp:extent cx="4572000" cy="2038350"/>
             <wp:effectExtent l="0" t="0" r="0" b="0"/>
             <wp:docPr id="1" name="Picture 1"/>
             <wp:cNvGraphicFramePr>
@@ -2027,7 +2097,7 @@
                     <pic:cNvPicPr/>
                   </pic:nvPicPr>
                   <pic:blipFill>
-                    <a:blip r:embed="rId10"/>
+                    <a:blip r:embed="rId9"/>
                     <a:stretch>
                       <a:fillRect/>
                     </a:stretch>
@@ -2035,7 +2105,7 @@
                   <pic:spPr>
                     <a:xfrm>
                       <a:off x="0" y="0"/>
-                      <a:ext cx="4572000" cy="2032000"/>
+                      <a:ext cx="4572000" cy="2038350"/>
                     </a:xfrm>
                     <a:prstGeom prst="rect">
                       <a:avLst/>
@@ -2090,20 +2160,20 @@
         <w:spacing w:after="160"/>
         <w:jc w:val="center"/>
         <w:rPr>
-          <w:rFonts w:eastAsia="宋体" w:hint="eastAsia"/>
-          <w:lang w:eastAsia="zh-CN"/>
-        </w:rPr>
-      </w:pPr>
-      <w:r>
-        <w:rPr>
           <w:rFonts w:eastAsia="宋体"/>
           <w:lang w:eastAsia="zh-CN"/>
         </w:rPr>
-        <w:lastRenderedPageBreak/>
+      </w:pPr>
+      <w:r>
+        <w:rPr>
+          <w:rFonts w:eastAsia="宋体"/>
+          <w:noProof/>
+          <w:lang w:eastAsia="zh-CN"/>
+        </w:rPr>
         <w:drawing>
-          <wp:inline distT="0" distB="0" distL="0" distR="0" wp14:anchorId="6FDD9EC8" wp14:editId="58B2360C">
-            <wp:extent cx="5943600" cy="3302000"/>
-            <wp:effectExtent l="0" t="0" r="0" b="0"/>
+          <wp:inline distT="0" distB="0" distL="0" distR="0" wp14:anchorId="6FDD9EC8" wp14:editId="2CB14CDE">
+            <wp:extent cx="5194300" cy="2717800"/>
+            <wp:effectExtent l="0" t="0" r="6350" b="6350"/>
             <wp:docPr id="199929204" name="图片 1"/>
             <wp:cNvGraphicFramePr>
               <a:graphicFrameLocks xmlns:a="http://schemas.openxmlformats.org/drawingml/2006/main" noChangeAspect="1"/>
@@ -2116,7 +2186,7 @@
                     <pic:cNvPicPr/>
                   </pic:nvPicPr>
                   <pic:blipFill>
-                    <a:blip r:embed="rId11"/>
+                    <a:blip r:embed="rId10"/>
                     <a:stretch>
                       <a:fillRect/>
                     </a:stretch>
@@ -2124,7 +2194,7 @@
                   <pic:spPr>
                     <a:xfrm>
                       <a:off x="0" y="0"/>
-                      <a:ext cx="5943600" cy="3302000"/>
+                      <a:ext cx="5194300" cy="2717800"/>
                     </a:xfrm>
                     <a:prstGeom prst="rect">
                       <a:avLst/>
@@ -2142,9 +2212,12 @@
         <w:jc w:val="center"/>
       </w:pPr>
       <w:r>
+        <w:rPr>
+          <w:noProof/>
+        </w:rPr>
         <w:drawing>
-          <wp:inline distT="0" distB="0" distL="0" distR="0" wp14:anchorId="25567D47" wp14:editId="5E355DEF">
-            <wp:extent cx="5943600" cy="3041650"/>
+          <wp:inline distT="0" distB="0" distL="0" distR="0" wp14:anchorId="25567D47" wp14:editId="20CD8F2A">
+            <wp:extent cx="4857750" cy="2298700"/>
             <wp:effectExtent l="0" t="0" r="0" b="6350"/>
             <wp:docPr id="2126542705" name="图片 1"/>
             <wp:cNvGraphicFramePr>
@@ -2158,7 +2231,7 @@
                     <pic:cNvPicPr/>
                   </pic:nvPicPr>
                   <pic:blipFill>
-                    <a:blip r:embed="rId12"/>
+                    <a:blip r:embed="rId11"/>
                     <a:stretch>
                       <a:fillRect/>
                     </a:stretch>
@@ -2166,7 +2239,7 @@
                   <pic:spPr>
                     <a:xfrm>
                       <a:off x="0" y="0"/>
-                      <a:ext cx="5943600" cy="3041650"/>
+                      <a:ext cx="4857750" cy="2298700"/>
                     </a:xfrm>
                     <a:prstGeom prst="rect">
                       <a:avLst/>
@@ -2197,6 +2270,7 @@
         <w:pStyle w:val="1"/>
       </w:pPr>
       <w:r>
+        <w:lastRenderedPageBreak/>
         <w:t>5. Discussion</w:t>
       </w:r>
     </w:p>
@@ -2213,11 +2287,15 @@
         <w:spacing w:after="80"/>
       </w:pPr>
       <w:r>
-        <w:t xml:space="preserve">Several existing solutions address retail demand forecasting, each with distinct trade-offs. Amazon Forecast [10] provides a fully managed cloud service that automatically selects from multiple algorithms (DeepAR+, ARIMA, ETS, NPTS) and supports weather-index features. However, it requires AWS infrastructure, incurs per-forecast costs, and operates as a black box that limits interpretability for small </w:t>
-      </w:r>
-      <w:r>
-        <w:lastRenderedPageBreak/>
-        <w:t>business owners. In contrast, Retail Inventory Twin runs entirely on a local machine with no cloud dependency, making it suitable for cost-sensitive small retailers.</w:t>
+        <w:t>Several existing solutions address retail demand forecasting, each with distinct trade-offs. Amazon Forecast [10] provides a fully managed cloud service that automatically selects from multiple algorithms (</w:t>
+      </w:r>
+      <w:proofErr w:type="spellStart"/>
+      <w:r>
+        <w:t>DeepAR</w:t>
+      </w:r>
+      <w:proofErr w:type="spellEnd"/>
+      <w:r>
+        <w:t>+, ARIMA, ETS, NPTS) and supports weather-index features. However, it requires AWS infrastructure, incurs per-forecast costs, and operates as a black box that limits interpretability for small business owners. In contrast, Retail Inventory Twin runs entirely on a local machine with no cloud dependency, making it suitable for cost-sensitive small retailers.</w:t>
       </w:r>
     </w:p>
     <w:p>
@@ -2225,7 +2303,23 @@
         <w:spacing w:after="80"/>
       </w:pPr>
       <w:r>
-        <w:t>The Kaggle Store Sales forecasting competition [9] showcases a range of approaches from traditional ARIMA to gradient-boosted trees (LightGBM, XGBoost) and deep learning (N-BEATS, Temporal Fusion Transformer). Top-performing solutions typically require extensive feature engineering, large training datasets (1,000+ store-item combinations), and significant computational resources. By comparison, Prophet with two weather regressors achieves meaningful accuracy improvements with minimal configuration, aligning with the project's goal of accessibility for non-technical users.</w:t>
+        <w:t>The Kaggle Store Sales forecasting competition [9] showcases a range of approaches from traditional ARIMA to gradient-boosted trees (</w:t>
+      </w:r>
+      <w:proofErr w:type="spellStart"/>
+      <w:r>
+        <w:t>LightGBM</w:t>
+      </w:r>
+      <w:proofErr w:type="spellEnd"/>
+      <w:r>
+        <w:t xml:space="preserve">, </w:t>
+      </w:r>
+      <w:proofErr w:type="spellStart"/>
+      <w:r>
+        <w:t>XGBoost</w:t>
+      </w:r>
+      <w:proofErr w:type="spellEnd"/>
+      <w:r>
+        <w:t>) and deep learning (N-BEATS, Temporal Fusion Transformer). Top-performing solutions typically require extensive feature engineering, large training datasets (1,000+ store-item combinations), and significant computational resources. By comparison, Prophet with two weather regressors achieves meaningful accuracy improvements with minimal configuration, aligning with the project's goal of accessibility for non-technical users.</w:t>
       </w:r>
     </w:p>
     <w:p>
@@ -2233,7 +2327,23 @@
         <w:spacing w:after="80"/>
       </w:pPr>
       <w:r>
-        <w:t>Recent academic work by Salinas et al. [11] on DeepAR demonstrates that autoregressive recurrent neural networks can produce accurate probabilistic forecasts across large product catalogs. While DeepAR excels at learning cross-item patterns in large-scale retail (thousands of SKUs), it requires substantial training data and GPU resources. Prophet's additive decomposition model is more appropriate for the small-catalog, limited-data regime targeted by this project (8 items, 27 months).</w:t>
+        <w:t xml:space="preserve">Recent academic work by Salinas et al. [11] on </w:t>
+      </w:r>
+      <w:proofErr w:type="spellStart"/>
+      <w:r>
+        <w:t>DeepAR</w:t>
+      </w:r>
+      <w:proofErr w:type="spellEnd"/>
+      <w:r>
+        <w:t xml:space="preserve"> demonstrates that autoregressive recurrent neural networks can produce accurate probabilistic forecasts across large product catalogs. While </w:t>
+      </w:r>
+      <w:proofErr w:type="spellStart"/>
+      <w:r>
+        <w:t>DeepAR</w:t>
+      </w:r>
+      <w:proofErr w:type="spellEnd"/>
+      <w:r>
+        <w:t xml:space="preserve"> excels at learning cross-item patterns in large-scale retail (thousands of SKUs), it requires substantial training data and GPU resources. Prophet's additive decomposition model is more appropriate for the small-catalog, limited-data regime targeted by this project (8 items, 27 months).</w:t>
       </w:r>
     </w:p>
     <w:p>
@@ -2289,6 +2399,7 @@
         <w:pStyle w:val="21"/>
       </w:pPr>
       <w:r>
+        <w:lastRenderedPageBreak/>
         <w:t>5.4 Future Improvements</w:t>
       </w:r>
     </w:p>
@@ -2297,7 +2408,15 @@
         <w:spacing w:after="80"/>
       </w:pPr>
       <w:r>
-        <w:t>Several enhancements could strengthen the system. First, integrating a live weather API (such as OpenWeatherMap) would replace synthetic weather data with real forecasts, enabling true real-time predictions. Second, adding a probabilistic forecast output (prediction intervals rather than point estimates) would help retailers quantify uncertainty in stock-out timing. Third, implementing a feedback loop where actual sales outcomes are compared against forecasts would enable continuous model improvement. Fourth, expanding the RAG validator to support multi-store configurations and additional product categories would broaden the system's applicability. Finally, deploying the application as a Docker container would simplify installation and eliminate dependency management issues across operating systems.</w:t>
+        <w:t xml:space="preserve">Several enhancements could strengthen the system. First, integrating a live weather API (such as </w:t>
+      </w:r>
+      <w:proofErr w:type="spellStart"/>
+      <w:r>
+        <w:t>OpenWeatherMap</w:t>
+      </w:r>
+      <w:proofErr w:type="spellEnd"/>
+      <w:r>
+        <w:t>) would replace synthetic weather data with real forecasts, enabling true real-time predictions. Second, adding a probabilistic forecast output (prediction intervals rather than point estimates) would help retailers quantify uncertainty in stock-out timing. Third, implementing a feedback loop where actual sales outcomes are compared against forecasts would enable continuous model improvement. Fourth, expanding the RAG validator to support multi-store configurations and additional product categories would broaden the system's applicability. Finally, deploying the application as a Docker container would simplify installation and eliminate dependency management issues across operating systems.</w:t>
       </w:r>
     </w:p>
     <w:p>
@@ -2305,16 +2424,26 @@
         <w:pStyle w:val="1"/>
       </w:pPr>
       <w:r>
-        <w:lastRenderedPageBreak/>
         <w:t>6. AI Prompts Used</w:t>
       </w:r>
     </w:p>
     <w:p>
       <w:pPr>
         <w:spacing w:after="80"/>
-      </w:pPr>
-      <w:r>
-        <w:t>Claude (Anthropic) was used extensively throughout the development of this project via Claude Code, an AI-assisted coding tool. Below is a chronological documentation of key prompts organized by development phase, including both prompts and summarized key responses. Over 15 substantial interactions are documented.</w:t>
+        <w:rPr>
+          <w:rFonts w:eastAsia="宋体" w:hint="eastAsia"/>
+          <w:lang w:eastAsia="zh-CN"/>
+        </w:rPr>
+      </w:pPr>
+      <w:r>
+        <w:t>Claude (Anthropic) was used extensively throughout the development of this project via Claude Code, an AI-assisted coding tool. Below is a chronological documentation of key prompts organized by development phase</w:t>
+      </w:r>
+      <w:r>
+        <w:rPr>
+          <w:rFonts w:eastAsia="宋体" w:hint="eastAsia"/>
+          <w:lang w:eastAsia="zh-CN"/>
+        </w:rPr>
+        <w:t>.</w:t>
       </w:r>
     </w:p>
     <w:p>
@@ -2368,7 +2497,23 @@
         <w:spacing w:after="80"/>
       </w:pPr>
       <w:r>
-        <w:t>"Generate synthetic coffee-shop sales data for 8 items with temperature-dependent demand. Hot drinks should sell more in cold weather. Include a Boston-like annual temperature cycle. Generate transaction-level records with item_id, item_name, quantity, and date."</w:t>
+        <w:t xml:space="preserve">"Generate synthetic coffee-shop sales data for 8 items with temperature-dependent demand. Hot drinks should sell more in cold weather. Include a Boston-like annual temperature cycle. Generate transaction-level records with </w:t>
+      </w:r>
+      <w:proofErr w:type="spellStart"/>
+      <w:r>
+        <w:t>item_id</w:t>
+      </w:r>
+      <w:proofErr w:type="spellEnd"/>
+      <w:r>
+        <w:t xml:space="preserve">, </w:t>
+      </w:r>
+      <w:proofErr w:type="spellStart"/>
+      <w:r>
+        <w:t>item_name</w:t>
+      </w:r>
+      <w:proofErr w:type="spellEnd"/>
+      <w:r>
+        <w:t>, quantity, and date."</w:t>
       </w:r>
     </w:p>
     <w:p>
@@ -2403,7 +2548,15 @@
         <w:spacing w:after="80"/>
       </w:pPr>
       <w:r>
-        <w:t>"The Prophet models are not capturing yearly seasonality. With only 3 months of data (Jan-Mar 2024), yearly_seasonality is disabled. How do I fix this?"</w:t>
+        <w:t xml:space="preserve">"The Prophet models are not capturing yearly seasonality. With only 3 months of data (Jan-Mar 2024), </w:t>
+      </w:r>
+      <w:proofErr w:type="spellStart"/>
+      <w:r>
+        <w:t>yearly_seasonality</w:t>
+      </w:r>
+      <w:proofErr w:type="spellEnd"/>
+      <w:r>
+        <w:t xml:space="preserve"> is disabled. How do I fix this?"</w:t>
       </w:r>
     </w:p>
     <w:p>
@@ -2411,7 +2564,15 @@
         <w:spacing w:after="120"/>
       </w:pPr>
       <w:r>
-        <w:t>Key Response: Claude explained that Prophet requires at least two full annual cycles to reliably estimate yearly seasonality. Recommended extending the synthetic data to 24+ months and setting yearly_seasonality=True. This led to expanding the dataset to 27 months (Jan 2024 to Mar 2026).</w:t>
+        <w:t xml:space="preserve">Key Response: Claude explained that Prophet requires at least two full annual cycles to reliably estimate yearly seasonality. Recommended extending the synthetic data to 24+ months and setting </w:t>
+      </w:r>
+      <w:proofErr w:type="spellStart"/>
+      <w:r>
+        <w:t>yearly_seasonality</w:t>
+      </w:r>
+      <w:proofErr w:type="spellEnd"/>
+      <w:r>
+        <w:t>=True. This led to expanding the dataset to 27 months (Jan 2024 to Mar 2026).</w:t>
       </w:r>
     </w:p>
     <w:p>
@@ -2422,34 +2583,21 @@
         <w:rPr>
           <w:b/>
         </w:rPr>
-        <w:t>Prompt 4 (Explanation — Seasonality Mode):</w:t>
-      </w:r>
-    </w:p>
-    <w:p>
-      <w:pPr>
-        <w:spacing w:after="80"/>
-      </w:pPr>
-      <w:r>
-        <w:t>"Should I use additive or multiplicative seasonality for coffee shop demand forecasting? What is the difference and which is better for temperature-driven demand?"</w:t>
-      </w:r>
-    </w:p>
-    <w:p>
-      <w:pPr>
-        <w:spacing w:after="120"/>
-      </w:pPr>
-      <w:r>
-        <w:t>Key Response: Claude explained that additive seasonality adds a fixed amount to the trend (e.g., +10 units every winter), while multiplicative seasonality scales proportionally (e.g., 1.3x in winter). Since coffee demand scales with temperature rather than shifting by a fixed amount, multiplicative mode was recommended. This was adopted in the final model configuration.</w:t>
-      </w:r>
-    </w:p>
-    <w:p>
-      <w:pPr>
-        <w:spacing w:after="80"/>
-      </w:pPr>
+        <w:t xml:space="preserve">Prompt </w:t>
+      </w:r>
+      <w:r>
+        <w:rPr>
+          <w:rFonts w:eastAsia="宋体" w:hint="eastAsia"/>
+          <w:b/>
+          <w:lang w:eastAsia="zh-CN"/>
+        </w:rPr>
+        <w:t>4</w:t>
+      </w:r>
       <w:r>
         <w:rPr>
           <w:b/>
         </w:rPr>
-        <w:t>Prompt 5 (Coding — Model Evaluation):</w:t>
+        <w:t xml:space="preserve"> (Coding — Model Evaluation):</w:t>
       </w:r>
     </w:p>
     <w:p>
@@ -2485,96 +2633,35 @@
         <w:rPr>
           <w:b/>
         </w:rPr>
-        <w:t>Prompt 6 (Coding — FastAPI Backend):</w:t>
-      </w:r>
-    </w:p>
-    <w:p>
-      <w:pPr>
-        <w:spacing w:after="80"/>
-      </w:pPr>
-      <w:r>
-        <w:t>"Implement a FastAPI backend for the Retail Inventory Twin. It should serve a single-page HTML frontend, accept file uploads (sales CSVs + stock snapshot), run the forecasting pipeline, and return the stock-out report. Include a retrain toggle so users can skip model fitting when models already exist."</w:t>
-      </w:r>
-    </w:p>
-    <w:p>
-      <w:pPr>
-        <w:spacing w:after="120"/>
-      </w:pPr>
-      <w:r>
-        <w:t>Key Response: Claude created app.py with four endpoints (/, /validate, /forecast, /report), file upload handling via UploadFile, subprocess pipeline execution, and the retrain query parameter for conditional model fitting.</w:t>
-      </w:r>
-    </w:p>
-    <w:p>
-      <w:pPr>
-        <w:spacing w:after="80"/>
-      </w:pPr>
+        <w:t xml:space="preserve">Prompt </w:t>
+      </w:r>
+      <w:r>
+        <w:rPr>
+          <w:rFonts w:eastAsia="宋体" w:hint="eastAsia"/>
+          <w:b/>
+          <w:lang w:eastAsia="zh-CN"/>
+        </w:rPr>
+        <w:t>5</w:t>
+      </w:r>
       <w:r>
         <w:rPr>
           <w:b/>
         </w:rPr>
-        <w:t>Prompt 7 (Coding — Frontend Design):</w:t>
-      </w:r>
-    </w:p>
-    <w:p>
-      <w:pPr>
-        <w:spacing w:after="80"/>
-      </w:pPr>
-      <w:r>
-        <w:t>"Create a clean, minimal HTML frontend for the inventory twin. It should have file pickers for sales CSVs (multiple) and stock snapshot (single), a retrain checkbox, a run button, status indicators, and a report display area. No React or Vue — just plain HTML/CSS/JS."</w:t>
-      </w:r>
-    </w:p>
-    <w:p>
-      <w:pPr>
-        <w:spacing w:after="120"/>
-      </w:pPr>
-      <w:r>
-        <w:t>Key Response: Claude designed static/index.html with a card-based layout, color-coded status banners (info/success/warning/error), CSS spinner animation, dark-themed monospace report textarea, and async fetch-based API calls.</w:t>
-      </w:r>
-    </w:p>
-    <w:p>
-      <w:pPr>
-        <w:spacing w:after="80"/>
-      </w:pPr>
+        <w:t xml:space="preserve"> (Coding — </w:t>
+      </w:r>
+      <w:proofErr w:type="spellStart"/>
       <w:r>
         <w:rPr>
           <w:b/>
         </w:rPr>
-        <w:t>Prompt 8 (Debugging — Windows Encoding):</w:t>
-      </w:r>
-    </w:p>
-    <w:p>
-      <w:pPr>
-        <w:spacing w:after="80"/>
-      </w:pPr>
-      <w:r>
-        <w:t>"The pipeline crashes on Windows when step outputs contain Unicode characters like delta and special dashes. The error says it cannot encode characters in GBK. How do I fix this?"</w:t>
-      </w:r>
-    </w:p>
-    <w:p>
-      <w:pPr>
-        <w:spacing w:after="120"/>
-      </w:pPr>
-      <w:r>
-        <w:t>Key Response: Claude diagnosed that Windows Python subprocesses default to the system's GBK encoding rather than UTF-8. The fix was to set env['PYTHONIOENCODING'] = 'utf-8' in the subprocess.run() call within pipeline.py.</w:t>
-      </w:r>
-    </w:p>
-    <w:p>
-      <w:pPr>
-        <w:pStyle w:val="21"/>
-      </w:pPr>
-      <w:r>
-        <w:t>6.4 Phase 4: RAG Validation Layer (April 7-8, 2026)</w:t>
-      </w:r>
-    </w:p>
-    <w:p>
-      <w:pPr>
-        <w:spacing w:after="80"/>
-      </w:pPr>
+        <w:t>FastAPI</w:t>
+      </w:r>
+      <w:proofErr w:type="spellEnd"/>
       <w:r>
         <w:rPr>
           <w:b/>
         </w:rPr>
-        <w:t>Prompt 9 (Research — RAG for Validation):</w:t>
+        <w:t xml:space="preserve"> Backend):</w:t>
       </w:r>
     </w:p>
     <w:p>
@@ -2582,7 +2669,15 @@
         <w:spacing w:after="80"/>
       </w:pPr>
       <w:r>
-        <w:t>"I want to add a validation layer that uses embeddings to check whether uploaded CSV data belongs to the coffee-shop domain before running the pipeline. What embedding model and vector database would you recommend for a lightweight, in-process solution?"</w:t>
+        <w:t xml:space="preserve">"Implement a </w:t>
+      </w:r>
+      <w:proofErr w:type="spellStart"/>
+      <w:r>
+        <w:t>FastAPI</w:t>
+      </w:r>
+      <w:proofErr w:type="spellEnd"/>
+      <w:r>
+        <w:t xml:space="preserve"> backend for the Retail Inventory Twin. It should serve a single-page HTML frontend, accept file uploads (sales CSVs + stock snapshot), run the forecasting pipeline, and return the stock-out report. Include a retrain toggle so users can skip model fitting when models already exist."</w:t>
       </w:r>
     </w:p>
     <w:p>
@@ -2590,7 +2685,15 @@
         <w:spacing w:after="120"/>
       </w:pPr>
       <w:r>
-        <w:t>Key Response: Claude recommended all-MiniLM-L6-v2 (22M parameters, CPU-friendly) with ChromaDB's EphemeralClient for zero-infrastructure vector storage. Suggested a document corpus with item profiles, schema definitions, and out-of-scope boundary examples.</w:t>
+        <w:t xml:space="preserve">Key Response: Claude created app.py with four endpoints (/, /validate, /forecast, /report), file upload handling via </w:t>
+      </w:r>
+      <w:proofErr w:type="spellStart"/>
+      <w:r>
+        <w:t>UploadFile</w:t>
+      </w:r>
+      <w:proofErr w:type="spellEnd"/>
+      <w:r>
+        <w:t>, subprocess pipeline execution, and the retrain query parameter for conditional model fitting.</w:t>
       </w:r>
     </w:p>
     <w:p>
@@ -2601,34 +2704,21 @@
         <w:rPr>
           <w:b/>
         </w:rPr>
-        <w:t>Prompt 10 (Coding — RAG Implementation):</w:t>
-      </w:r>
-    </w:p>
-    <w:p>
-      <w:pPr>
-        <w:spacing w:after="80"/>
-      </w:pPr>
-      <w:r>
-        <w:t>"Implement the RAG validator with the following architecture: three document categories (item_profile, schema, boundary), a two-query strategy that separates column validation from item domain validation, and threshold-based decisions (accepted/warning/rejected). Include boundary detection to catch out-of-domain data like electronics inventory."</w:t>
-      </w:r>
-    </w:p>
-    <w:p>
-      <w:pPr>
-        <w:spacing w:after="120"/>
-      </w:pPr>
-      <w:r>
-        <w:t>Key Response: Claude created rag_validator.py with the full two-query architecture, lazy initialization with thread-safe double-checked locking, cosine similarity thresholds, and boundary flag override logic. Also integrated the validator into app.py's /validate endpoint.</w:t>
-      </w:r>
-    </w:p>
-    <w:p>
-      <w:pPr>
-        <w:spacing w:after="80"/>
-      </w:pPr>
+        <w:t xml:space="preserve">Prompt </w:t>
+      </w:r>
+      <w:r>
+        <w:rPr>
+          <w:rFonts w:eastAsia="宋体" w:hint="eastAsia"/>
+          <w:b/>
+          <w:lang w:eastAsia="zh-CN"/>
+        </w:rPr>
+        <w:t>6</w:t>
+      </w:r>
       <w:r>
         <w:rPr>
           <w:b/>
         </w:rPr>
-        <w:t>Prompt 11 (Debugging — RAG False Positives):</w:t>
+        <w:t xml:space="preserve"> (Coding — Frontend Design):</w:t>
       </w:r>
     </w:p>
     <w:p>
@@ -2636,7 +2726,7 @@
         <w:spacing w:after="80"/>
       </w:pPr>
       <w:r>
-        <w:t>"The RAG validator is accepting data with electronics items like Xbox and PlayStation. The item similarity score is above the warning threshold because the column structure matches. How do I make it reject out-of-domain item names more reliably?"</w:t>
+        <w:t>"Create a clean, minimal HTML frontend for the inventory twin. It should have file pickers for sales CSVs (multiple) and stock snapshot (single), a retrain checkbox, a run button, status indicators, and a report display area. No React or Vue — just plain HTML/CSS/JS."</w:t>
       </w:r>
     </w:p>
     <w:p>
@@ -2644,11 +2734,23 @@
         <w:spacing w:after="120"/>
       </w:pPr>
       <w:r>
-        <w:t xml:space="preserve">Key Response: Claude identified that column vocabulary was dominating the embedding, masking domain mismatches. The fix was to split into two separate queries: Query A for column structure and </w:t>
-      </w:r>
-      <w:r>
-        <w:lastRenderedPageBreak/>
-        <w:t>Query B for item content only. Additionally, expanded boundary documents were added to explicitly cover gaming hardware and Apple computing devices.</w:t>
+        <w:t xml:space="preserve">Key Response: Claude designed static/index.html with a card-based layout, color-coded status banners (info/success/warning/error), CSS spinner animation, dark-themed monospace report </w:t>
+      </w:r>
+      <w:proofErr w:type="spellStart"/>
+      <w:r>
+        <w:t>textarea</w:t>
+      </w:r>
+      <w:proofErr w:type="spellEnd"/>
+      <w:r>
+        <w:t>, and async fetch-based API calls.</w:t>
+      </w:r>
+    </w:p>
+    <w:p>
+      <w:pPr>
+        <w:pStyle w:val="21"/>
+      </w:pPr>
+      <w:r>
+        <w:t>6.4 Phase 4: RAG Validation Layer (April 7-8, 2026)</w:t>
       </w:r>
     </w:p>
     <w:p>
@@ -2659,42 +2761,21 @@
         <w:rPr>
           <w:b/>
         </w:rPr>
-        <w:t>Prompt 12 (Debugging — Threshold Tuning):</w:t>
-      </w:r>
-    </w:p>
-    <w:p>
-      <w:pPr>
-        <w:spacing w:after="80"/>
-      </w:pPr>
-      <w:r>
-        <w:t>"The RAG validator gives a similarity score of 0.58 for valid coffee-shop data and 0.52 for electronics data. The gap is too small. How can I improve separation between in-domain and out-of-domain inputs?"</w:t>
-      </w:r>
-    </w:p>
-    <w:p>
-      <w:pPr>
-        <w:spacing w:after="120"/>
-      </w:pPr>
-      <w:r>
-        <w:t>Key Response: Claude recommended three changes: (1) increase the row sampling from 5 to 50 rows to capture more item diversity, (2) raise the WARN_THRESHOLD from 0.35 to 0.40, and (3) add the boundary flag override that hard-rejects when the best global match is a boundary document. These changes widened the similarity gap to valid data scoring approximately 0.68 and electronics data scoring approximately 0.34.</w:t>
-      </w:r>
-    </w:p>
-    <w:p>
-      <w:pPr>
-        <w:pStyle w:val="21"/>
-      </w:pPr>
-      <w:r>
-        <w:t>6.5 Phase 5: Report and Visualization (April 8-14, 2026)</w:t>
-      </w:r>
-    </w:p>
-    <w:p>
-      <w:pPr>
-        <w:spacing w:after="80"/>
-      </w:pPr>
+        <w:t xml:space="preserve">Prompt </w:t>
+      </w:r>
+      <w:r>
+        <w:rPr>
+          <w:rFonts w:eastAsia="宋体" w:hint="eastAsia"/>
+          <w:b/>
+          <w:lang w:eastAsia="zh-CN"/>
+        </w:rPr>
+        <w:t>7</w:t>
+      </w:r>
       <w:r>
         <w:rPr>
           <w:b/>
         </w:rPr>
-        <w:t>Prompt 13 (Coding — Visualization):</w:t>
+        <w:t xml:space="preserve"> (Research — RAG for Validation):</w:t>
       </w:r>
     </w:p>
     <w:p>
@@ -2702,7 +2783,7 @@
         <w:spacing w:after="80"/>
       </w:pPr>
       <w:r>
-        <w:t>"Create three matplotlib figures for the report: (1) stock-out risk ranking with alert/caution thresholds, (2) inventory depletion curves for all 8 items in a grid layout, and (3) a bar chart of delta MAE showing weather improvement by item with a meaningful threshold line."</w:t>
+        <w:t>"I want to add a validation layer that uses embeddings to check whether uploaded CSV data belongs to the coffee-shop domain before running the pipeline. What embedding model and vector database would you recommend for a lightweight, in-process solution?"</w:t>
       </w:r>
     </w:p>
     <w:p>
@@ -2710,7 +2791,23 @@
         <w:spacing w:after="120"/>
       </w:pPr>
       <w:r>
-        <w:t>Key Response: Claude implemented step9_report.py with the three figures, including color-coded baseline vs. weather bars, 4-column subplot grid for depletion curves, and a horizontal threshold line at delta MAE = 0.5.</w:t>
+        <w:t xml:space="preserve">Key Response: Claude recommended all-MiniLM-L6-v2 (22M parameters, CPU-friendly) with </w:t>
+      </w:r>
+      <w:proofErr w:type="spellStart"/>
+      <w:r>
+        <w:t>ChromaDB's</w:t>
+      </w:r>
+      <w:proofErr w:type="spellEnd"/>
+      <w:r>
+        <w:t xml:space="preserve"> </w:t>
+      </w:r>
+      <w:proofErr w:type="spellStart"/>
+      <w:r>
+        <w:t>EphemeralClient</w:t>
+      </w:r>
+      <w:proofErr w:type="spellEnd"/>
+      <w:r>
+        <w:t xml:space="preserve"> for zero-infrastructure vector storage. Suggested a document corpus with item profiles, schema definitions, and out-of-scope boundary examples.</w:t>
       </w:r>
     </w:p>
     <w:p>
@@ -2721,34 +2818,21 @@
         <w:rPr>
           <w:b/>
         </w:rPr>
-        <w:t>Prompt 14 (Coding — Jupyter Notebook):</w:t>
-      </w:r>
-    </w:p>
-    <w:p>
-      <w:pPr>
-        <w:spacing w:after="80"/>
-      </w:pPr>
-      <w:r>
-        <w:t>"Create a Jupyter notebook for exploratory data analysis covering raw sales distributions, weather patterns, sales-weather correlation, model performance comparison, and stock-out risk."</w:t>
-      </w:r>
-    </w:p>
-    <w:p>
-      <w:pPr>
-        <w:spacing w:after="120"/>
-      </w:pPr>
-      <w:r>
-        <w:t>Key Response: Claude created create_notebook.py that programmatically generates retail_inventory_eda.ipynb with six analysis sections and inline matplotlib visualizations.</w:t>
-      </w:r>
-    </w:p>
-    <w:p>
-      <w:pPr>
-        <w:spacing w:after="80"/>
-      </w:pPr>
+        <w:t xml:space="preserve">Prompt </w:t>
+      </w:r>
+      <w:r>
+        <w:rPr>
+          <w:rFonts w:eastAsia="宋体" w:hint="eastAsia"/>
+          <w:b/>
+          <w:lang w:eastAsia="zh-CN"/>
+        </w:rPr>
+        <w:t>8</w:t>
+      </w:r>
       <w:r>
         <w:rPr>
           <w:b/>
         </w:rPr>
-        <w:t>Prompt 15 (Coding — Report Generation):</w:t>
+        <w:t xml:space="preserve"> (Coding — RAG Implementation):</w:t>
       </w:r>
     </w:p>
     <w:p>
@@ -2756,7 +2840,15 @@
         <w:spacing w:after="80"/>
       </w:pPr>
       <w:r>
-        <w:t>"Read the Final_Project_Report_guideline.pdf and draft the report based on the guideline's requirements and the content of this project. The report should be saved as docs first so I can edit it myself."</w:t>
+        <w:t>"Implement the RAG validator with the following architecture: three document categories (</w:t>
+      </w:r>
+      <w:proofErr w:type="spellStart"/>
+      <w:r>
+        <w:t>item_profile</w:t>
+      </w:r>
+      <w:proofErr w:type="spellEnd"/>
+      <w:r>
+        <w:t>, schema, boundary), a two-query strategy that separates column validation from item domain validation, and threshold-based decisions (accepted/warning/rejected). Include boundary detection to catch out-of-domain data like electronics inventory."</w:t>
       </w:r>
     </w:p>
     <w:p>
@@ -2764,8 +2856,25 @@
         <w:spacing w:after="120"/>
       </w:pPr>
       <w:r>
-        <w:t>Key Response: Claude analyzed the grading rubric, explored the full project structure and outputs, and generated this report as a .docx file using python-docx with proper academic formatting.</w:t>
-      </w:r>
+        <w:t xml:space="preserve">Key Response: Claude created rag_validator.py with the full two-query architecture, lazy initialization with thread-safe double-checked locking, cosine similarity thresholds, and boundary flag override logic. Also integrated the validator into </w:t>
+      </w:r>
+      <w:proofErr w:type="spellStart"/>
+      <w:r>
+        <w:t>app.py's</w:t>
+      </w:r>
+      <w:proofErr w:type="spellEnd"/>
+      <w:r>
+        <w:t xml:space="preserve"> /validate endpoint.</w:t>
+      </w:r>
+    </w:p>
+    <w:p>
+      <w:pPr>
+        <w:spacing w:after="120"/>
+        <w:rPr>
+          <w:rFonts w:eastAsia="宋体" w:hint="eastAsia"/>
+          <w:lang w:eastAsia="zh-CN"/>
+        </w:rPr>
+      </w:pPr>
     </w:p>
     <w:p>
       <w:pPr>
@@ -2784,7 +2893,21 @@
         <w:rPr>
           <w:sz w:val="20"/>
         </w:rPr>
-        <w:t>[1] K. Katsaliaki and S. C. Brailsford. "Using simulation to improve the blood supply chain." Journal of the Operational Research Society, 58(2):219-227, 2007.</w:t>
+        <w:t xml:space="preserve">[1] K. </w:t>
+      </w:r>
+      <w:proofErr w:type="spellStart"/>
+      <w:r>
+        <w:rPr>
+          <w:sz w:val="20"/>
+        </w:rPr>
+        <w:t>Katsaliaki</w:t>
+      </w:r>
+      <w:proofErr w:type="spellEnd"/>
+      <w:r>
+        <w:rPr>
+          <w:sz w:val="20"/>
+        </w:rPr>
+        <w:t xml:space="preserve"> and S. C. Brailsford. "Using simulation to improve the blood supply chain." Journal of the Operational Research Society, 58(2):219-227, 2007.</w:t>
       </w:r>
     </w:p>
     <w:p>
@@ -2844,31 +2967,21 @@
         <w:rPr>
           <w:sz w:val="20"/>
         </w:rPr>
-        <w:t>[6] Chroma. "ChromaDB: The AI-native open-source embedding database." 2023. https://www.trychroma.com/</w:t>
-      </w:r>
-    </w:p>
-    <w:p>
-      <w:pPr>
-        <w:spacing w:after="60"/>
-        <w:ind w:left="397" w:hanging="397"/>
-      </w:pPr>
+        <w:t>[6] Chroma. "</w:t>
+      </w:r>
+      <w:proofErr w:type="spellStart"/>
       <w:r>
         <w:rPr>
           <w:sz w:val="20"/>
         </w:rPr>
-        <w:t>[7] N. Reimers and I. Gurevych. "Sentence-BERT: Sentence Embeddings using Siamese BERT-Networks." Proceedings of EMNLP-IJCNLP, pp. 3982-3992, 2019.</w:t>
-      </w:r>
-    </w:p>
-    <w:p>
-      <w:pPr>
-        <w:spacing w:after="60"/>
-        <w:ind w:left="397" w:hanging="397"/>
-      </w:pPr>
+        <w:t>ChromaDB</w:t>
+      </w:r>
+      <w:proofErr w:type="spellEnd"/>
       <w:r>
         <w:rPr>
           <w:sz w:val="20"/>
         </w:rPr>
-        <w:t>[8] S. Ramirez. "FastAPI: Modern, fast web framework for building APIs with Python." 2019. https://fastapi.tiangolo.com/</w:t>
+        <w:t>: The AI-native open-source embedding database." 2023. https://www.trychroma.com/</w:t>
       </w:r>
     </w:p>
     <w:p>
@@ -2881,6 +2994,58 @@
           <w:sz w:val="20"/>
         </w:rPr>
         <w:lastRenderedPageBreak/>
+        <w:t xml:space="preserve">[7] N. Reimers and I. </w:t>
+      </w:r>
+      <w:proofErr w:type="spellStart"/>
+      <w:r>
+        <w:rPr>
+          <w:sz w:val="20"/>
+        </w:rPr>
+        <w:t>Gurevych</w:t>
+      </w:r>
+      <w:proofErr w:type="spellEnd"/>
+      <w:r>
+        <w:rPr>
+          <w:sz w:val="20"/>
+        </w:rPr>
+        <w:t>. "Sentence-BERT: Sentence Embeddings using Siamese BERT-Networks." Proceedings of EMNLP-IJCNLP, pp. 3982-3992, 2019.</w:t>
+      </w:r>
+    </w:p>
+    <w:p>
+      <w:pPr>
+        <w:spacing w:after="60"/>
+        <w:ind w:left="397" w:hanging="397"/>
+      </w:pPr>
+      <w:r>
+        <w:rPr>
+          <w:sz w:val="20"/>
+        </w:rPr>
+        <w:t>[8] S. Ramirez. "</w:t>
+      </w:r>
+      <w:proofErr w:type="spellStart"/>
+      <w:r>
+        <w:rPr>
+          <w:sz w:val="20"/>
+        </w:rPr>
+        <w:t>FastAPI</w:t>
+      </w:r>
+      <w:proofErr w:type="spellEnd"/>
+      <w:r>
+        <w:rPr>
+          <w:sz w:val="20"/>
+        </w:rPr>
+        <w:t>: Modern, fast web framework for building APIs with Python." 2019. https://fastapi.tiangolo.com/</w:t>
+      </w:r>
+    </w:p>
+    <w:p>
+      <w:pPr>
+        <w:spacing w:after="60"/>
+        <w:ind w:left="397" w:hanging="397"/>
+      </w:pPr>
+      <w:r>
+        <w:rPr>
+          <w:sz w:val="20"/>
+        </w:rPr>
         <w:t>[9] Kaggle. "Store Sales — Time Series Forecasting." Kaggle Competition, 2022. https://www.kaggle.com/competitions/store-sales-time-series-forecasting</w:t>
       </w:r>
     </w:p>
@@ -2905,7 +3070,35 @@
         <w:rPr>
           <w:sz w:val="20"/>
         </w:rPr>
-        <w:t>[11] D. Salinas, V. Flunkert, J. Gasthaus, and T. Januschowski. "DeepAR: Probabilistic forecasting with autoregressive recurrent networks." International Journal of Forecasting, 36(3):1181-1191, 2020.</w:t>
+        <w:t xml:space="preserve">[11] D. Salinas, V. </w:t>
+      </w:r>
+      <w:proofErr w:type="spellStart"/>
+      <w:r>
+        <w:rPr>
+          <w:sz w:val="20"/>
+        </w:rPr>
+        <w:t>Flunkert</w:t>
+      </w:r>
+      <w:proofErr w:type="spellEnd"/>
+      <w:r>
+        <w:rPr>
+          <w:sz w:val="20"/>
+        </w:rPr>
+        <w:t>, J. Gasthaus, and T. Januschowski. "</w:t>
+      </w:r>
+      <w:proofErr w:type="spellStart"/>
+      <w:r>
+        <w:rPr>
+          <w:sz w:val="20"/>
+        </w:rPr>
+        <w:t>DeepAR</w:t>
+      </w:r>
+      <w:proofErr w:type="spellEnd"/>
+      <w:r>
+        <w:rPr>
+          <w:sz w:val="20"/>
+        </w:rPr>
+        <w:t>: Probabilistic forecasting with autoregressive recurrent networks." International Journal of Forecasting, 36(3):1181-1191, 2020.</w:t>
       </w:r>
     </w:p>
     <w:p>
@@ -2945,7 +3138,15 @@
         <w:spacing w:after="80"/>
       </w:pPr>
       <w:r>
-        <w:t>Prerequisites: Python 3.10+, conda (recommended) or pip.</w:t>
+        <w:t xml:space="preserve">Prerequisites: Python 3.10+, </w:t>
+      </w:r>
+      <w:proofErr w:type="spellStart"/>
+      <w:r>
+        <w:t>conda</w:t>
+      </w:r>
+      <w:proofErr w:type="spellEnd"/>
+      <w:r>
+        <w:t xml:space="preserve"> (recommended) or pip.</w:t>
       </w:r>
     </w:p>
     <w:p>
@@ -2987,15 +3188,47 @@
         <w:spacing w:after="80"/>
       </w:pPr>
       <w:r>
-        <w:t xml:space="preserve">    pip install pandas numpy scikit-learn prophet matplotlib seaborn</w:t>
+        <w:t xml:space="preserve">    pip install pandas </w:t>
+      </w:r>
+      <w:proofErr w:type="spellStart"/>
+      <w:r>
+        <w:t>numpy</w:t>
+      </w:r>
+      <w:proofErr w:type="spellEnd"/>
+      <w:r>
+        <w:t xml:space="preserve"> scikit-learn prophet matplotlib seaborn</w:t>
       </w:r>
       <w:r>
         <w:br/>
-        <w:t xml:space="preserve">    pip install fastapi uvicorn python-multipart</w:t>
+        <w:t xml:space="preserve">    pip install </w:t>
+      </w:r>
+      <w:proofErr w:type="spellStart"/>
+      <w:r>
+        <w:t>fastapi</w:t>
+      </w:r>
+      <w:proofErr w:type="spellEnd"/>
+      <w:r>
+        <w:t xml:space="preserve"> </w:t>
+      </w:r>
+      <w:proofErr w:type="spellStart"/>
+      <w:r>
+        <w:t>uvicorn</w:t>
+      </w:r>
+      <w:proofErr w:type="spellEnd"/>
+      <w:r>
+        <w:t xml:space="preserve"> python-multipart</w:t>
       </w:r>
       <w:r>
         <w:br/>
-        <w:t xml:space="preserve">    pip install chromadb sentence-transformers</w:t>
+        <w:t xml:space="preserve">    pip install </w:t>
+      </w:r>
+      <w:proofErr w:type="spellStart"/>
+      <w:r>
+        <w:t>chromadb</w:t>
+      </w:r>
+      <w:proofErr w:type="spellEnd"/>
+      <w:r>
+        <w:t xml:space="preserve"> sentence-transformers</w:t>
       </w:r>
     </w:p>
     <w:p>
@@ -3052,7 +3285,23 @@
         <w:spacing w:after="80"/>
       </w:pPr>
       <w:r>
-        <w:t xml:space="preserve">    uvicorn app:app --reload --host 0.0.0.0 --port 8000</w:t>
+        <w:t xml:space="preserve">    </w:t>
+      </w:r>
+      <w:proofErr w:type="spellStart"/>
+      <w:r>
+        <w:t>uvicorn</w:t>
+      </w:r>
+      <w:proofErr w:type="spellEnd"/>
+      <w:r>
+        <w:t xml:space="preserve"> </w:t>
+      </w:r>
+      <w:proofErr w:type="spellStart"/>
+      <w:r>
+        <w:t>app:app</w:t>
+      </w:r>
+      <w:proofErr w:type="spellEnd"/>
+      <w:r>
+        <w:t xml:space="preserve"> --reload --host 0.0.0.0 --port 8000</w:t>
       </w:r>
       <w:r>
         <w:br/>
@@ -3121,7 +3370,23 @@
           <w:sz w:val="20"/>
         </w:rPr>
         <w:br/>
-        <w:t xml:space="preserve">  app.py                 -- FastAPI backend (4 endpoints)</w:t>
+        <w:t xml:space="preserve">  app.py                 -- </w:t>
+      </w:r>
+      <w:proofErr w:type="spellStart"/>
+      <w:r>
+        <w:rPr>
+          <w:rFonts w:ascii="Consolas" w:hAnsi="Consolas"/>
+          <w:sz w:val="20"/>
+        </w:rPr>
+        <w:t>FastAPI</w:t>
+      </w:r>
+      <w:proofErr w:type="spellEnd"/>
+      <w:r>
+        <w:rPr>
+          <w:rFonts w:ascii="Consolas" w:hAnsi="Consolas"/>
+          <w:sz w:val="20"/>
+        </w:rPr>
+        <w:t xml:space="preserve"> backend (4 endpoints)</w:t>
       </w:r>
       <w:r>
         <w:rPr>
@@ -3137,7 +3402,39 @@
           <w:sz w:val="20"/>
         </w:rPr>
         <w:br/>
-        <w:t xml:space="preserve">  rag_validator.py       -- RAG validation layer (ChromaDB + MiniLM)</w:t>
+        <w:t xml:space="preserve">  rag_validator.py       -- RAG validation layer (</w:t>
+      </w:r>
+      <w:proofErr w:type="spellStart"/>
+      <w:r>
+        <w:rPr>
+          <w:rFonts w:ascii="Consolas" w:hAnsi="Consolas"/>
+          <w:sz w:val="20"/>
+        </w:rPr>
+        <w:t>ChromaDB</w:t>
+      </w:r>
+      <w:proofErr w:type="spellEnd"/>
+      <w:r>
+        <w:rPr>
+          <w:rFonts w:ascii="Consolas" w:hAnsi="Consolas"/>
+          <w:sz w:val="20"/>
+        </w:rPr>
+        <w:t xml:space="preserve"> + </w:t>
+      </w:r>
+      <w:proofErr w:type="spellStart"/>
+      <w:r>
+        <w:rPr>
+          <w:rFonts w:ascii="Consolas" w:hAnsi="Consolas"/>
+          <w:sz w:val="20"/>
+        </w:rPr>
+        <w:t>MiniLM</w:t>
+      </w:r>
+      <w:proofErr w:type="spellEnd"/>
+      <w:r>
+        <w:rPr>
+          <w:rFonts w:ascii="Consolas" w:hAnsi="Consolas"/>
+          <w:sz w:val="20"/>
+        </w:rPr>
+        <w:t>)</w:t>
       </w:r>
       <w:r>
         <w:rPr>
@@ -3161,7 +3458,23 @@
           <w:sz w:val="20"/>
         </w:rPr>
         <w:br/>
-        <w:t xml:space="preserve">  retail_inventory_eda.ipynb  -- Exploratory data analysis notebook</w:t>
+        <w:t xml:space="preserve">  </w:t>
+      </w:r>
+      <w:proofErr w:type="spellStart"/>
+      <w:r>
+        <w:rPr>
+          <w:rFonts w:ascii="Consolas" w:hAnsi="Consolas"/>
+          <w:sz w:val="20"/>
+        </w:rPr>
+        <w:t>retail_inventory_eda.ipynb</w:t>
+      </w:r>
+      <w:proofErr w:type="spellEnd"/>
+      <w:r>
+        <w:rPr>
+          <w:rFonts w:ascii="Consolas" w:hAnsi="Consolas"/>
+          <w:sz w:val="20"/>
+        </w:rPr>
+        <w:t xml:space="preserve">  -- Exploratory data analysis notebook</w:t>
       </w:r>
       <w:r>
         <w:rPr>
@@ -3177,6 +3490,7 @@
         <w:pStyle w:val="21"/>
       </w:pPr>
       <w:r>
+        <w:lastRenderedPageBreak/>
         <w:t>8.4 Use Cases and Target Users</w:t>
       </w:r>
     </w:p>
@@ -3185,11 +3499,7 @@
         <w:spacing w:after="80"/>
       </w:pPr>
       <w:r>
-        <w:t xml:space="preserve">The Retail Inventory Twin addresses the needs of several specific user groups. First, small coffee shop and bakery owners who currently rely on manual inventory counts and intuition for reorder decisions. The </w:t>
-      </w:r>
-      <w:r>
-        <w:lastRenderedPageBreak/>
-        <w:t>system provides them with a data-driven 14-day forecast and clear stock-out risk alerts (ALERT, Caution, OK) without requiring technical expertise. A shop owner can upload their point-of-sale CSV export and stock counts to receive actionable reorder guidance within minutes.</w:t>
+        <w:t>The Retail Inventory Twin addresses the needs of several specific user groups. First, small coffee shop and bakery owners who currently rely on manual inventory counts and intuition for reorder decisions. The system provides them with a data-driven 14-day forecast and clear stock-out risk alerts (ALERT, Caution, OK) without requiring technical expertise. A shop owner can upload their point-of-sale CSV export and stock counts to receive actionable reorder guidance within minutes.</w:t>
       </w:r>
     </w:p>
     <w:p>
@@ -4038,6 +4348,7 @@
   <w:style w:type="character" w:default="1" w:styleId="a2">
     <w:name w:val="Default Paragraph Font"/>
     <w:uiPriority w:val="1"/>
+    <w:semiHidden/>
     <w:unhideWhenUsed/>
   </w:style>
   <w:style w:type="table" w:default="1" w:styleId="a3">

</xml_diff>